<commit_message>
Improve WhatsApp, ML readiness, and viewport coverage
Co-authored-by: arena-agent <297053741+arena-agent@users.noreply.github.com>
</commit_message>
<xml_diff>
--- a/docs/CourtLOG_Overview.docx
+++ b/docs/CourtLOG_Overview.docx
@@ -8,7 +8,12 @@
         <w:jc w:val="center"/>
       </w:pPr>
       <w:r>
-        <w:t>CourtLOG: System Overview &amp; Production Guide</w:t>
+        <w:t>CourtLOG — Competition Prototype Overview</w:t>
+      </w:r>
+    </w:p>
+    <w:p>
+      <w:r>
+        <w:t>CourtLOG is a competition-team software prototype, not a government entity, certified public-sector service, or production-ready court system. Feature development is authorized and does not wait on government approval. Use fictional/demo records unless written permission authorizes specific real data.</w:t>
       </w:r>
     </w:p>
     <w:p>
@@ -16,43 +21,39 @@
         <w:pStyle w:val="Heading1"/>
       </w:pPr>
       <w:r>
-        <w:t>1. How the System Works</w:t>
+        <w:t>1. What the prototype contains</w:t>
       </w:r>
     </w:p>
     <w:p>
+      <w:pPr>
+        <w:pStyle w:val="ListBullet"/>
+      </w:pPr>
       <w:r>
-        <w:t>CourtLOG is a full-stack, AI-augmented Case Management and Delay Compliance system designed specifically for the Judiciary. It bridges the gap between physical court operations (like bailiffs serving writs) and digital tracking.</w:t>
-        <w:br/>
+        <w:t>A FastAPI backend with authenticated, role-scoped case workflows, a persistent SQLite option, and audit events. Server authorization remains authoritative.</w:t>
       </w:r>
+    </w:p>
+    <w:p>
+      <w:pPr>
+        <w:pStyle w:val="ListBullet"/>
+      </w:pPr>
       <w:r>
-        <w:rPr>
-          <w:b/>
-        </w:rPr>
-        <w:br/>
-        <w:t xml:space="preserve">• The Backend (Python/FastAPI): </w:t>
+        <w:t>A responsive browser interface and installable Sheriff QR-capture PWA. The PWA does not queue custody scans offline; an offline scan is not a confirmed check-in.</w:t>
       </w:r>
+    </w:p>
+    <w:p>
+      <w:pPr>
+        <w:pStyle w:val="ListBullet"/>
+      </w:pPr>
       <w:r>
-        <w:t>Acts as the brain of the system. It manages the database of cases, handles API requests from the frontend, and runs a background chron-job (Compliance Sweep) that checks for overdue cases. It integrates with WhatsApp to send automated alerts when cases breach their adjournment thresholds.</w:t>
+        <w:t>Experimental delay-risk code can load a provenance-checked versioned model artifact or use a disclosed deterministic heuristic fallback; the prediction source is reported. The legacy tracked CSV has rule-generated labels calibrated from real-derived distributions with unverified permission and is never selected by default or treated as synthetic. Training requires an explicit dataset and provenance; permitted real-data evaluation also requires documented permission and case-grouped forward-time splits. No trained model artifact was produced and no real court data was used for training or evaluation in this work; automated tests use synthetic fixtures only. There is no independent validation against real outcomes. Scores are not legal findings and must not drive adjudicative or other consequential decisions. See docs/ML_EVALUATION_READINESS.md.</w:t>
       </w:r>
+    </w:p>
+    <w:p>
+      <w:pPr>
+        <w:pStyle w:val="ListBullet"/>
+      </w:pPr>
       <w:r>
-        <w:rPr>
-          <w:b/>
-        </w:rPr>
-        <w:br/>
-        <w:t xml:space="preserve">• The Frontend (HTML/JS/Tailwind): </w:t>
-      </w:r>
-      <w:r>
-        <w:t>A premium, glassmorphic dashboard where judges, clerks, and the Deputy Chief Registrar (DCR) can log into their respective portals. It provides real-time analytics, QR chain-of-custody tracking, and visual badges for case status.</w:t>
-      </w:r>
-      <w:r>
-        <w:rPr>
-          <w:b/>
-        </w:rPr>
-        <w:br/>
-        <w:t xml:space="preserve">• The AI/ML Layer: </w:t>
-      </w:r>
-      <w:r>
-        <w:t>CourtLOG utilizes a trained Random Forest classifier to predict the likelihood of case delays based on historical data.</w:t>
+        <w:t>Workflow timers, execution prompts, and document output are configured prototypes. Do not describe them as legally approved rules or forms; legal-rule changes require Law Lead sign-off.</w:t>
       </w:r>
     </w:p>
     <w:p>
@@ -60,43 +61,36 @@
         <w:pStyle w:val="Heading1"/>
       </w:pPr>
       <w:r>
-        <w:t>2. Security Features</w:t>
+        <w:t>2. WhatsApp delivery: current state</w:t>
       </w:r>
     </w:p>
     <w:p>
       <w:r>
-        <w:t>As a system handling sensitive judicial data, CourtLOG implements several layers of security:</w:t>
-        <w:br/>
+        <w:t>The code contains an opt-in-gated Meta WhatsApp Cloud API adapter for one-to-one generic template notices. The implemented adjournment event is the notification trigger; the app does not send sheriff overdue-writ alerts or join existing registry groups. Case numbers, hearing dates, reasons, and case details are not placed in the provider message payload.</w:t>
       </w:r>
+    </w:p>
+    <w:p>
+      <w:pPr>
+        <w:pStyle w:val="ListBullet"/>
+      </w:pPr>
       <w:r>
-        <w:rPr>
-          <w:b/>
-        </w:rPr>
-        <w:br/>
-        <w:t xml:space="preserve">• Role-Based Access Control (RBAC): </w:t>
+        <w:t>A phone number in a case is not consent. The Chief Registrar screen records existing consent evidence; it does not collect or independently verify consent. An active opt-in is checked again before sending, and inbound STOP/UNSUBSCRIBE keywords revoke it.</w:t>
       </w:r>
+    </w:p>
+    <w:p>
+      <w:pPr>
+        <w:pStyle w:val="ListBullet"/>
+      </w:pPr>
       <w:r>
-        <w:t>Users log in with specific roles (Sheriff, Clerk, DCR, Judge). A Clerk cannot approve an override; only the DCR has the cryptographic/system authority to unblock overdue cases.</w:t>
+        <w:t>The adapter is disabled by default. DEMO_MODE=true always blocks real sends. The signed HTTPS webhook handles provider status callbacks and opt-outs; message records keep keyed recipient hashes and masked numbers rather than raw numbers.</w:t>
       </w:r>
+    </w:p>
+    <w:p>
+      <w:pPr>
+        <w:pStyle w:val="ListBullet"/>
+      </w:pPr>
       <w:r>
-        <w:rPr>
-          <w:b/>
-        </w:rPr>
-        <w:br/>
-        <w:t xml:space="preserve">• Audit Logging (Chain of Custody): </w:t>
-      </w:r>
-      <w:r>
-        <w:t>Every time a writ is moved, served, or adjourned, the system logs the exact timestamp and the ID of the personnel responsible. This prevents tampering and ensures accountability.</w:t>
-      </w:r>
-      <w:r>
-        <w:rPr>
-          <w:b/>
-        </w:rPr>
-        <w:br/>
-        <w:t xml:space="preserve">• Environment Variables: </w:t>
-      </w:r>
-      <w:r>
-        <w:t>Sensitive information (like the WhatsApp API token and database credentials) is never hardcoded. It is loaded securely via a .env file.</w:t>
+        <w:t>A provider HTTP acceptance is not proof of delivery. The activity log can show queued, accepted, sent, delivered, read, failed, simulated, disabled, or unknown. Unknown network outcomes are not automatically retried because Meta may already have accepted the message.</w:t>
       </w:r>
     </w:p>
     <w:p>
@@ -104,38 +98,57 @@
         <w:pStyle w:val="Heading1"/>
       </w:pPr>
       <w:r>
-        <w:t>3. Applications and Impact</w:t>
+        <w:t>3. Controlled Cloud API test setup</w:t>
       </w:r>
     </w:p>
     <w:p>
       <w:r>
-        <w:rPr>
-          <w:b/>
-        </w:rPr>
-        <w:t xml:space="preserve">• Eliminating Bottlenecks: </w:t>
+        <w:t>A real delivery test requires an external Meta WhatsApp Business setup and a public HTTPS staging origin. Government approval is not a prerequisite for team development; Meta account/template setup, applicable Meta terms, and the recipient's explicit opt-in are prerequisites for a real message.</w:t>
       </w:r>
+    </w:p>
+    <w:p>
+      <w:pPr>
+        <w:pStyle w:val="ListBullet"/>
+      </w:pPr>
       <w:r>
-        <w:t>By automatically flagging cases that have been adjourned more than 3 times, the Chief Judge can immediately spot administrative bottlenecks.</w:t>
+        <w:t>Create/configure the Meta Business account, WhatsApp phone number, Cloud API app, and an approved generic template with no case-specific variables. Use a team-controlled test recipient.</w:t>
       </w:r>
+    </w:p>
+    <w:p>
+      <w:pPr>
+        <w:pStyle w:val="ListBullet"/>
+      </w:pPr>
       <w:r>
-        <w:rPr>
-          <w:b/>
-        </w:rPr>
-        <w:br/>
-        <w:t xml:space="preserve">• Automated Accountability: </w:t>
+        <w:t>Deploy the webhook at https://&lt;staging-host&gt;/api/whatsapp/webhook and subscribe the Meta app to message/status events. Verify the GET challenge and signed POST callbacks against the staging deployment.</w:t>
       </w:r>
+    </w:p>
+    <w:p>
+      <w:pPr>
+        <w:pStyle w:val="ListBullet"/>
+      </w:pPr>
       <w:r>
-        <w:t>Sheriffs receive automated WhatsApp messages the moment a writ becomes overdue, eliminating the "I forgot" or "I wasn't informed" excuses.</w:t>
+        <w:t>Provision the variables listed in .env.example through the deployment secret manager (or an ignored local environment file for local development): WHATSAPP_ENABLED, WHATSAPP_ACCESS_TOKEN, WHATSAPP_PHONE_NUMBER_ID, WHATSAPP_API_VERSION, WHATSAPP_TEMPLATE_NAME, WHATSAPP_TEMPLATE_LANGUAGE, WHATSAPP_APP_SECRET, WHATSAPP_WEBHOOK_VERIFY_TOKEN, and a stable WHATSAPP_CONSENT_HASH_KEY of at least 32 bytes. Never commit or share secrets.</w:t>
       </w:r>
+    </w:p>
+    <w:p>
+      <w:pPr>
+        <w:pStyle w:val="ListBullet"/>
+      </w:pPr>
       <w:r>
-        <w:rPr>
-          <w:b/>
-        </w:rPr>
-        <w:br/>
-        <w:t xml:space="preserve">• Transparency for the NJC: </w:t>
+        <w:t>Keep WHATSAPP_ENABLED=false until the controlled test is ready. For the isolated live-send staging test only, set DEMO_MODE=false and WHATSAPP_ENABLED=true; record the recipient's actual opt-in evidence, send the generic test template, and verify provider callbacks and a STOP opt-out.</w:t>
       </w:r>
+    </w:p>
+    <w:p>
+      <w:pPr>
+        <w:pStyle w:val="ListBullet"/>
+      </w:pPr>
       <w:r>
-        <w:t>The system includes a 1-click "Export NJC Report" feature, allowing courts to instantly generate compliance reports for the National Judicial Council, saving weeks of manual data entry.</w:t>
+        <w:t>Inspect the privacy-minimized activity log. Treat accepted/sent as intermediate states; confirm delivered/read callbacks before claiming delivery. Investigate unknown before any manual retry.</w:t>
+      </w:r>
+    </w:p>
+    <w:p>
+      <w:r>
+        <w:t>Live Meta delivery has not been verified in this repository environment: no Meta account, approved template, server secrets, public webhook, or controlled live recipient was supplied. The automated WhatsApp tests use a mocked provider and do not send network messages.</w:t>
       </w:r>
     </w:p>
     <w:p>
@@ -143,98 +156,39 @@
         <w:pStyle w:val="Heading1"/>
       </w:pPr>
       <w:r>
-        <w:t>4. WhatsApp Business API: Step-by-Step Setup</w:t>
-      </w:r>
-    </w:p>
-    <w:p>
-      <w:r>
-        <w:t>To move the WhatsApp messaging from the development/testing phase into production, you need a permanent WhatsApp API key from Meta (Facebook).</w:t>
+        <w:t>4. Safe verification and acceptance</w:t>
       </w:r>
     </w:p>
     <w:p>
       <w:pPr>
-        <w:pStyle w:val="Heading2"/>
+        <w:pStyle w:val="ListBullet"/>
       </w:pPr>
       <w:r>
-        <w:t>Step 1: Create a Meta Developer App</w:t>
-      </w:r>
-    </w:p>
-    <w:p>
-      <w:r>
-        <w:t>1. Go to developers.facebook.com and log in with your Meta/Facebook account.</w:t>
-        <w:br/>
-        <w:t>2. Click on My Apps (top right) and then click the green Create App button.</w:t>
-        <w:br/>
-        <w:t>3. Select Other (or Business) as the use case and hit Next.</w:t>
-        <w:br/>
-        <w:t>4. Select Business as the app type.</w:t>
-        <w:br/>
-        <w:t>5. Name your app (e.g., CourtLOG System) and connect it to your Facebook Business Manager account.</w:t>
+        <w:t>Run .venv/bin/python -m pytest tests/test_security.py -k whatsapp -q to exercise the mocked send request, opt-in gate, privacy-minimized logging, signed callbacks, opt-out, concurrency guard, and ambiguous-timeout behavior. This is not a live delivery test.</w:t>
       </w:r>
     </w:p>
     <w:p>
       <w:pPr>
-        <w:pStyle w:val="Heading2"/>
+        <w:pStyle w:val="ListBullet"/>
       </w:pPr>
       <w:r>
-        <w:t>Step 2: Add WhatsApp to Your App</w:t>
-      </w:r>
-    </w:p>
-    <w:p>
-      <w:r>
-        <w:t>1. Once your app is created, you will be on the App Dashboard.</w:t>
-        <w:br/>
-        <w:t>2. Scroll down to find the WhatsApp product card and click Set Up.</w:t>
-        <w:br/>
-        <w:t>3. Meta will provide you with a temporary access token and a test phone number. Note: Temporary tokens expire every 24 hours.</w:t>
+        <w:t>For the responsive interface smoke test, install the Playwright Chromium browser once with `npx playwright install chromium`, then run `npm run test:viewport`. It uses fictional API fixtures and records screenshots under the ignored .local/viewport-pass/ directory for 1600×900, 1366×768, 1024×768, 768×1024, and 390×844. This headless check does not replace the actual phone, camera, printer, PWA-install, accessibility, or zoom tests.</w:t>
       </w:r>
     </w:p>
     <w:p>
       <w:pPr>
-        <w:pStyle w:val="Heading2"/>
+        <w:pStyle w:val="ListBullet"/>
       </w:pPr>
       <w:r>
-        <w:t>Step 3: Generate a Permanent System User Token</w:t>
-      </w:r>
-    </w:p>
-    <w:p>
-      <w:r>
-        <w:t>To get a key that never expires for the .env file:</w:t>
-        <w:br/>
-        <w:t>1. Go to business.facebook.com and navigate to Business Settings.</w:t>
-        <w:br/>
-        <w:t>2. On the left sidebar, go to Users &gt; System Users.</w:t>
-        <w:br/>
-        <w:t>3. Click Add to create a new System User (name it CourtLOG API User) and give it Admin access.</w:t>
-        <w:br/>
-        <w:t>4. Click on the new System User and select Generate New Token.</w:t>
-        <w:br/>
-        <w:t>5. Select your App from the dropdown.</w:t>
-        <w:br/>
-        <w:t>6. Check the permissions: whatsapp_business_messaging and whatsapp_business_management.</w:t>
-        <w:br/>
-        <w:t>7. Click Generate Token. Copy this extremely long string immediately.</w:t>
+        <w:t>Do not train or evaluate predictive behavior with tracked court records or real-derived distributions without the user's documented permission. Synthetic tests validate software behavior, not real-world model performance.</w:t>
       </w:r>
     </w:p>
     <w:p>
       <w:pPr>
-        <w:pStyle w:val="Heading2"/>
+        <w:pStyle w:val="ListBullet"/>
       </w:pPr>
       <w:r>
-        <w:t>Step 4: Configure the .env File</w:t>
-      </w:r>
-    </w:p>
-    <w:p>
-      <w:r>
-        <w:t>In your backend folder, create a new file named .env and add your credentials like this:</w:t>
-        <w:br/>
-        <w:br/>
-        <w:t>WHATSAPP_TOKEN="PASTE_YOUR_LONG_PERMANENT_TOKEN_HERE"</w:t>
-        <w:br/>
-        <w:t>WHATSAPP_PHONE_ID="PASTE_YOUR_WHATSAPP_PHONE_NUMBER_ID_HERE"</w:t>
-        <w:br/>
-        <w:br/>
-        <w:t>Once this is saved, the Python backend will automatically load these credentials using python-dotenv and send real messages to production numbers!</w:t>
+        <w:t>Complete phone/tablet, camera, install, printer, HTTPS staging, recovery, backup/restore, and operational acceptance separately before any pilot claim.</w:t>
       </w:r>
     </w:p>
     <w:sectPr>

</xml_diff>

<commit_message>
Implement approved pilot role model and scope enforcement
Co-authored-by: arena-agent <297053741+arena-agent@users.noreply.github.com>
</commit_message>
<xml_diff>
--- a/docs/CourtLOG_Overview.docx
+++ b/docs/CourtLOG_Overview.docx
@@ -38,6 +38,14 @@
       </w:pPr>
       <w:r>
         <w:t>A responsive browser interface and installable Sheriff QR-capture PWA. The PWA does not queue custody scans offline; an offline scan is not a confirmed check-in.</w:t>
+      </w:r>
+    </w:p>
+    <w:p>
+      <w:pPr>
+        <w:pStyle w:val="ListBullet"/>
+      </w:pPr>
+      <w:r>
+        <w:t>The approved first-pilot role model covers Chief Judge, Chief Registrar, Deputy Chief Registrar, Registrar, Filing Clerk, Registry Clerk, Court Clerk, Bailiff, and Sheriff; optional Presiding Judge access is read-only. Court Clerk requires a server-side organization/deployment entitlement, which does not process or verify payment. Legacy Clerk accounts are blocked from sign-in until a Chief Registrar explicitly remaps them; Cashier/Fees Clerk, Counsel, and Counsel's Clerk remain unavailable until separately approved. See docs/COURTLOG_ROLE_ACCESS_MATRIX.md.</w:t>
       </w:r>
     </w:p>
     <w:p>

</xml_diff>